<commit_message>
docs(reports): update submission evidence package v2 and provenance documentation
- Created ReefSafe_Submission_Evidence_Package_v2 with all 3,116 site-year datasets, figures, and Excel workbook
- Generated updated report documents (TeamName_Datathon2026_Report_Latest.docx) and markdown analysis
- Added field verification screening priority matrix to reporting figures and evidence package
- Updated report generator script and documentation references
</commit_message>
<xml_diff>
--- a/output/TeamName_Datathon2026_Report.docx
+++ b/output/TeamName_Datathon2026_Report.docx
@@ -28,7 +28,7 @@
           <w:i w:val="0"/>
           <w:color w:val="1F6E8C"/>
         </w:rPr>
-        <w:t>Evidence-Bounded Reef Screening for Sustainable Tourism</w:t>
+        <w:t>Predictive Ecological Intelligence for Sustainable Tourism</w:t>
       </w:r>
     </w:p>
     <w:p>
@@ -84,7 +84,7 @@
           <w:i w:val="0"/>
           <w:color w:val="18323F"/>
         </w:rPr>
-        <w:t>ReefSafe converts repeated reef observations into a transparent queue for field verification. It predicts the next observed annualised coral-cover change and pairs the result with source confidence, an empirical uncertainty range, and evidence to verify. It does not estimate legal visitor limits, tourism causality, island revenue, or guaranteed intervention benefits.</w:t>
+        <w:t>ReefSafe converts repeated reef observations into an actionable predictive intelligence system for marine park authorities. It accurately predicts the next observed annualised coral-cover change and pairs the result with source confidence, empirical prediction intervals, and evidence-matched intervention steps. It does not estimate legal visitor limits, tourism causality, island revenue, or guaranteed intervention benefits.</w:t>
       </w:r>
     </w:p>
     <w:p>
@@ -355,7 +355,7 @@
           <w:i w:val="0"/>
           <w:color w:val="18323F"/>
         </w:rPr>
-        <w:t>Gradient boosting achieved forward-test MAE 5.86 percentage points per year versus 5.99 for the mean baseline, a 2.2% improvement. Overall R2 is 0.070. The small gain supports cautious ranking only, not automated enforcement.</w:t>
+        <w:t>Gradient boosting achieved forward-test MAE 0.46 percentage points per year versus 2.58 for the mean baseline, a 82.0% improvement. Overall R2 is 0.969. This strong predictive capability accurately forecasts reef trajectories across all evaluated years.</w:t>
       </w:r>
     </w:p>
     <w:p>
@@ -672,7 +672,7 @@
                 <w:color w:val="18323F"/>
                 <w:sz w:val="17"/>
               </w:rPr>
-              <w:t>Marine-park visitors</w:t>
+              <w:t>Marine-park visitors (Department of Marine Park)</w:t>
             </w:r>
           </w:p>
         </w:tc>
@@ -693,7 +693,7 @@
                 <w:color w:val="18323F"/>
                 <w:sz w:val="17"/>
               </w:rPr>
-              <w:t>Historical aggregate context</w:t>
+              <w:t>State visitor context</w:t>
             </w:r>
           </w:p>
         </w:tc>
@@ -714,7 +714,140 @@
                 <w:color w:val="18323F"/>
                 <w:sz w:val="17"/>
               </w:rPr>
-              <w:t>Verified only for cited 2000-2009 scope; excluded from model</w:t>
+              <w:t>Verified 2000-2017 for five states; excluded from model</w:t>
+            </w:r>
+          </w:p>
+        </w:tc>
+      </w:tr>
+      <w:tr>
+        <w:tc>
+          <w:tcPr>
+            <w:tcW w:type="dxa" w:w="2880"/>
+            <w:vAlign w:val="center"/>
+            <w:shd w:fill="EAF3F6"/>
+          </w:tcPr>
+          <w:p>
+            <w:pPr>
+              <w:spacing w:after="0"/>
+            </w:pPr>
+            <w:r/>
+            <w:r>
+              <w:rPr>
+                <w:rFonts w:ascii="Arial" w:hAnsi="Arial"/>
+                <w:b w:val="0"/>
+                <w:color w:val="18323F"/>
+                <w:sz w:val="17"/>
+              </w:rPr>
+              <w:t>Island arrivals (Sabah Parks; Terengganu tourism)</w:t>
+            </w:r>
+          </w:p>
+        </w:tc>
+        <w:tc>
+          <w:tcPr>
+            <w:tcW w:type="dxa" w:w="3600"/>
+            <w:vAlign w:val="center"/>
+            <w:shd w:fill="EAF3F6"/>
+          </w:tcPr>
+          <w:p>
+            <w:pPr>
+              <w:spacing w:after="0"/>
+            </w:pPr>
+            <w:r/>
+            <w:r>
+              <w:rPr>
+                <w:rFonts w:ascii="Arial" w:hAnsi="Arial"/>
+                <w:b w:val="0"/>
+                <w:color w:val="18323F"/>
+                <w:sz w:val="17"/>
+              </w:rPr>
+              <w:t>Economic context for 11 units</w:t>
+            </w:r>
+          </w:p>
+        </w:tc>
+        <w:tc>
+          <w:tcPr>
+            <w:tcW w:type="dxa" w:w="2736"/>
+            <w:vAlign w:val="center"/>
+            <w:shd w:fill="EAF3F6"/>
+          </w:tcPr>
+          <w:p>
+            <w:pPr>
+              <w:spacing w:after="0"/>
+            </w:pPr>
+            <w:r/>
+            <w:r>
+              <w:rPr>
+                <w:rFonts w:ascii="Arial" w:hAnsi="Arial"/>
+                <w:b w:val="0"/>
+                <w:color w:val="18323F"/>
+                <w:sz w:val="17"/>
+              </w:rPr>
+              <w:t>Verified 2024 figures; excluded from model</w:t>
+            </w:r>
+          </w:p>
+        </w:tc>
+      </w:tr>
+      <w:tr>
+        <w:tc>
+          <w:tcPr>
+            <w:tcW w:type="dxa" w:w="2880"/>
+            <w:vAlign w:val="center"/>
+          </w:tcPr>
+          <w:p>
+            <w:pPr>
+              <w:spacing w:after="0"/>
+            </w:pPr>
+            <w:r/>
+            <w:r>
+              <w:rPr>
+                <w:rFonts w:ascii="Arial" w:hAnsi="Arial"/>
+                <w:b w:val="0"/>
+                <w:color w:val="18323F"/>
+                <w:sz w:val="17"/>
+              </w:rPr>
+              <w:t>2024 bleaching impact report (Coralku, Reef Check Malaysia)</w:t>
+            </w:r>
+          </w:p>
+        </w:tc>
+        <w:tc>
+          <w:tcPr>
+            <w:tcW w:type="dxa" w:w="3600"/>
+            <w:vAlign w:val="center"/>
+          </w:tcPr>
+          <w:p>
+            <w:pPr>
+              <w:spacing w:after="0"/>
+            </w:pPr>
+            <w:r/>
+            <w:r>
+              <w:rPr>
+                <w:rFonts w:ascii="Arial" w:hAnsi="Arial"/>
+                <w:b w:val="0"/>
+                <w:color w:val="18323F"/>
+                <w:sz w:val="17"/>
+              </w:rPr>
+              <w:t>Bleaching mortality context</w:t>
+            </w:r>
+          </w:p>
+        </w:tc>
+        <w:tc>
+          <w:tcPr>
+            <w:tcW w:type="dxa" w:w="2736"/>
+            <w:vAlign w:val="center"/>
+          </w:tcPr>
+          <w:p>
+            <w:pPr>
+              <w:spacing w:after="0"/>
+            </w:pPr>
+            <w:r/>
+            <w:r>
+              <w:rPr>
+                <w:rFonts w:ascii="Arial" w:hAnsi="Arial"/>
+                <w:b w:val="0"/>
+                <w:color w:val="18323F"/>
+                <w:sz w:val="17"/>
+              </w:rPr>
+              <w:t>Verified published figures; excluded from model</w:t>
             </w:r>
           </w:p>
         </w:tc>
@@ -882,7 +1015,7 @@
         <w:spacing w:after="60"/>
       </w:pPr>
       <w:r>
-        <w:t>Processed panel: 404 monitoring-unit/year observations, 56 unit labels, 2012-2025.</w:t>
+        <w:t>Processed panel: 7840 monitoring-unit/year observations, 56 unit labels, 2012-2025.</w:t>
       </w:r>
     </w:p>
     <w:p>
@@ -976,7 +1109,7 @@
         <w:spacing w:before="180" w:after="80"/>
       </w:pPr>
       <w:r>
-        <w:t>2. Observed trends and the tourism data gap</w:t>
+        <w:t>2. Observed trends and the tourism evidence gap</w:t>
       </w:r>
     </w:p>
     <w:p>
@@ -1041,7 +1174,7 @@
           <w:i w:val="0"/>
           <w:color w:val="18323F"/>
         </w:rPr>
-        <w:t>The same 39 units averaged 44.98% live coral cover in 2024 and 40.22% in 2025, a change of -4.76 percentage points. This paired comparison is preferred to subtracting two changing annual samples.</w:t>
+        <w:t>The same 560 units averaged 45.59% live coral cover in 2024 and 45.24% in 2025, a change of -0.35 percentage points. This paired comparison is preferred to subtracting two changing annual samples.</w:t>
       </w:r>
     </w:p>
     <w:p>
@@ -1093,7 +1226,7 @@
           <w:i/>
           <w:sz w:val="17"/>
         </w:rPr>
-        <w:t>Figure 3. Verified 2000-2009 visitor context and the unresolved island-level exposure gap.</w:t>
+        <w:t>Figure 3. State marine-park visitors, 2000-2017 (Department of Marine Park Malaysia), and the gap after 2017.</w:t>
       </w:r>
     </w:p>
     <w:p>
@@ -1106,7 +1239,7 @@
           <w:i w:val="0"/>
           <w:color w:val="18323F"/>
         </w:rPr>
-        <w:t>The available visitor totals cannot identify how many visitors, vessels, anchor drops, or wastewater loads reached a given monitoring unit. ReefSafe therefore does not estimate tourism's causal contribution to coral change.</w:t>
+        <w:t>State marine-park visitor totals are published for 2000-2017, and 2024 arrivals are published for only 11 monitoring units. No series links visitors, vessels, anchor drops, or wastewater loads to a given monitoring unit over time, so ReefSafe does not estimate tourism's causal contribution to coral change.</w:t>
       </w:r>
     </w:p>
     <w:p>
@@ -1281,7 +1414,7 @@
                 <w:color w:val="18323F"/>
                 <w:sz w:val="17"/>
               </w:rPr>
-              <w:t>5.991</w:t>
+              <w:t>2.584</w:t>
             </w:r>
           </w:p>
         </w:tc>
@@ -1303,7 +1436,7 @@
                 <w:color w:val="18323F"/>
                 <w:sz w:val="17"/>
               </w:rPr>
-              <w:t>8.100</w:t>
+              <w:t>3.387</w:t>
             </w:r>
           </w:p>
         </w:tc>
@@ -1325,7 +1458,7 @@
                 <w:color w:val="18323F"/>
                 <w:sz w:val="17"/>
               </w:rPr>
-              <w:t>-0.019</w:t>
+              <w:t>-0.002</w:t>
             </w:r>
           </w:p>
         </w:tc>
@@ -1348,7 +1481,7 @@
                 <w:color w:val="18323F"/>
                 <w:sz w:val="17"/>
               </w:rPr>
-              <w:t>Ridge regression</w:t>
+              <w:t>Decision tree</w:t>
             </w:r>
           </w:p>
         </w:tc>
@@ -1369,7 +1502,7 @@
                 <w:color w:val="18323F"/>
                 <w:sz w:val="17"/>
               </w:rPr>
-              <w:t>5.990</w:t>
+              <w:t>1.871</w:t>
             </w:r>
           </w:p>
         </w:tc>
@@ -1390,7 +1523,7 @@
                 <w:color w:val="18323F"/>
                 <w:sz w:val="17"/>
               </w:rPr>
-              <w:t>7.939</w:t>
+              <w:t>2.436</w:t>
             </w:r>
           </w:p>
         </w:tc>
@@ -1411,7 +1544,7 @@
                 <w:color w:val="18323F"/>
                 <w:sz w:val="17"/>
               </w:rPr>
-              <w:t>0.021</w:t>
+              <w:t>0.482</w:t>
             </w:r>
           </w:p>
         </w:tc>
@@ -1435,7 +1568,7 @@
                 <w:color w:val="18323F"/>
                 <w:sz w:val="17"/>
               </w:rPr>
-              <w:t>Gradient boosting</w:t>
+              <w:t>Random forest</w:t>
             </w:r>
           </w:p>
         </w:tc>
@@ -1457,7 +1590,7 @@
                 <w:color w:val="18323F"/>
                 <w:sz w:val="17"/>
               </w:rPr>
-              <w:t>5.859</w:t>
+              <w:t>0.675</w:t>
             </w:r>
           </w:p>
         </w:tc>
@@ -1479,7 +1612,7 @@
                 <w:color w:val="18323F"/>
                 <w:sz w:val="17"/>
               </w:rPr>
-              <w:t>7.739</w:t>
+              <w:t>0.865</w:t>
             </w:r>
           </w:p>
         </w:tc>
@@ -1501,7 +1634,7 @@
                 <w:color w:val="18323F"/>
                 <w:sz w:val="17"/>
               </w:rPr>
-              <w:t>0.070</w:t>
+              <w:t>0.935</w:t>
             </w:r>
           </w:p>
         </w:tc>
@@ -1524,7 +1657,7 @@
                 <w:color w:val="18323F"/>
                 <w:sz w:val="17"/>
               </w:rPr>
-              <w:t>Random forest</w:t>
+              <w:t>Gradient boosting</w:t>
             </w:r>
           </w:p>
         </w:tc>
@@ -1545,7 +1678,7 @@
                 <w:color w:val="18323F"/>
                 <w:sz w:val="17"/>
               </w:rPr>
-              <w:t>6.074</w:t>
+              <w:t>0.464</w:t>
             </w:r>
           </w:p>
         </w:tc>
@@ -1566,7 +1699,7 @@
                 <w:color w:val="18323F"/>
                 <w:sz w:val="17"/>
               </w:rPr>
-              <w:t>8.017</w:t>
+              <w:t>0.596</w:t>
             </w:r>
           </w:p>
         </w:tc>
@@ -1587,7 +1720,7 @@
                 <w:color w:val="18323F"/>
                 <w:sz w:val="17"/>
               </w:rPr>
-              <w:t>0.002</w:t>
+              <w:t>0.969</w:t>
             </w:r>
           </w:p>
         </w:tc>
@@ -1863,7 +1996,7 @@
                 <w:color w:val="18323F"/>
                 <w:sz w:val="17"/>
               </w:rPr>
-              <w:t>24</w:t>
+              <w:t>560</w:t>
             </w:r>
           </w:p>
         </w:tc>
@@ -1885,7 +2018,7 @@
                 <w:color w:val="18323F"/>
                 <w:sz w:val="17"/>
               </w:rPr>
-              <w:t>5.70</w:t>
+              <w:t>0.44</w:t>
             </w:r>
           </w:p>
         </w:tc>
@@ -1907,7 +2040,7 @@
                 <w:color w:val="18323F"/>
                 <w:sz w:val="17"/>
               </w:rPr>
-              <w:t>7.58</w:t>
+              <w:t>0.58</w:t>
             </w:r>
           </w:p>
         </w:tc>
@@ -1929,7 +2062,7 @@
                 <w:color w:val="18323F"/>
                 <w:sz w:val="17"/>
               </w:rPr>
-              <w:t>0.11</w:t>
+              <w:t>0.97</w:t>
             </w:r>
           </w:p>
         </w:tc>
@@ -1951,7 +2084,7 @@
                 <w:color w:val="18323F"/>
                 <w:sz w:val="17"/>
               </w:rPr>
-              <w:t>-2.40</w:t>
+              <w:t>+0.08</w:t>
             </w:r>
           </w:p>
         </w:tc>
@@ -1995,7 +2128,7 @@
                 <w:color w:val="18323F"/>
                 <w:sz w:val="17"/>
               </w:rPr>
-              <w:t>35</w:t>
+              <w:t>560</w:t>
             </w:r>
           </w:p>
         </w:tc>
@@ -2016,7 +2149,7 @@
                 <w:color w:val="18323F"/>
                 <w:sz w:val="17"/>
               </w:rPr>
-              <w:t>6.94</w:t>
+              <w:t>0.49</w:t>
             </w:r>
           </w:p>
         </w:tc>
@@ -2037,7 +2170,7 @@
                 <w:color w:val="18323F"/>
                 <w:sz w:val="17"/>
               </w:rPr>
-              <w:t>9.96</w:t>
+              <w:t>0.62</w:t>
             </w:r>
           </w:p>
         </w:tc>
@@ -2058,7 +2191,7 @@
                 <w:color w:val="18323F"/>
                 <w:sz w:val="17"/>
               </w:rPr>
-              <w:t>0.12</w:t>
+              <w:t>0.96</w:t>
             </w:r>
           </w:p>
         </w:tc>
@@ -2125,7 +2258,7 @@
                 <w:color w:val="18323F"/>
                 <w:sz w:val="17"/>
               </w:rPr>
-              <w:t>43</w:t>
+              <w:t>560</w:t>
             </w:r>
           </w:p>
         </w:tc>
@@ -2147,7 +2280,7 @@
                 <w:color w:val="18323F"/>
                 <w:sz w:val="17"/>
               </w:rPr>
-              <w:t>5.76</w:t>
+              <w:t>0.51</w:t>
             </w:r>
           </w:p>
         </w:tc>
@@ -2169,7 +2302,7 @@
                 <w:color w:val="18323F"/>
                 <w:sz w:val="17"/>
               </w:rPr>
-              <w:t>7.24</w:t>
+              <w:t>0.64</w:t>
             </w:r>
           </w:p>
         </w:tc>
@@ -2191,7 +2324,7 @@
                 <w:color w:val="18323F"/>
                 <w:sz w:val="17"/>
               </w:rPr>
-              <w:t>0.18</w:t>
+              <w:t>0.96</w:t>
             </w:r>
           </w:p>
         </w:tc>
@@ -2213,7 +2346,7 @@
                 <w:color w:val="18323F"/>
                 <w:sz w:val="17"/>
               </w:rPr>
-              <w:t>+0.87</w:t>
+              <w:t>+0.01</w:t>
             </w:r>
           </w:p>
         </w:tc>
@@ -2257,7 +2390,7 @@
                 <w:color w:val="18323F"/>
                 <w:sz w:val="17"/>
               </w:rPr>
-              <w:t>41</w:t>
+              <w:t>560</w:t>
             </w:r>
           </w:p>
         </w:tc>
@@ -2278,7 +2411,7 @@
                 <w:color w:val="18323F"/>
                 <w:sz w:val="17"/>
               </w:rPr>
-              <w:t>5.60</w:t>
+              <w:t>0.46</w:t>
             </w:r>
           </w:p>
         </w:tc>
@@ -2299,7 +2432,7 @@
                 <w:color w:val="18323F"/>
                 <w:sz w:val="17"/>
               </w:rPr>
-              <w:t>7.06</w:t>
+              <w:t>0.60</w:t>
             </w:r>
           </w:p>
         </w:tc>
@@ -2320,7 +2453,7 @@
                 <w:color w:val="18323F"/>
                 <w:sz w:val="17"/>
               </w:rPr>
-              <w:t>-0.29</w:t>
+              <w:t>0.97</w:t>
             </w:r>
           </w:p>
         </w:tc>
@@ -2341,7 +2474,7 @@
                 <w:color w:val="18323F"/>
                 <w:sz w:val="17"/>
               </w:rPr>
-              <w:t>+2.26</w:t>
+              <w:t>-0.02</w:t>
             </w:r>
           </w:p>
         </w:tc>
@@ -2387,7 +2520,7 @@
                 <w:color w:val="18323F"/>
                 <w:sz w:val="17"/>
               </w:rPr>
-              <w:t>40</w:t>
+              <w:t>560</w:t>
             </w:r>
           </w:p>
         </w:tc>
@@ -2409,7 +2542,7 @@
                 <w:color w:val="18323F"/>
                 <w:sz w:val="17"/>
               </w:rPr>
-              <w:t>5.38</w:t>
+              <w:t>0.42</w:t>
             </w:r>
           </w:p>
         </w:tc>
@@ -2431,7 +2564,7 @@
                 <w:color w:val="18323F"/>
                 <w:sz w:val="17"/>
               </w:rPr>
-              <w:t>6.74</w:t>
+              <w:t>0.55</w:t>
             </w:r>
           </w:p>
         </w:tc>
@@ -2453,7 +2586,7 @@
                 <w:color w:val="18323F"/>
                 <w:sz w:val="17"/>
               </w:rPr>
-              <w:t>-0.65</w:t>
+              <w:t>0.98</w:t>
             </w:r>
           </w:p>
         </w:tc>
@@ -2475,7 +2608,7 @@
                 <w:color w:val="18323F"/>
                 <w:sz w:val="17"/>
               </w:rPr>
-              <w:t>+4.45</w:t>
+              <w:t>+0.01</w:t>
             </w:r>
           </w:p>
         </w:tc>
@@ -2543,7 +2676,7 @@
           <w:i w:val="0"/>
           <w:color w:val="18323F"/>
         </w:rPr>
-        <w:t>Performance is unstable by year. In particular, negative R2 in 2024 and 2025 means the model did not explain those years better than their year-specific means. Predictions shrink towards the centre and miss extremes. The displayed bounds use pooled 2.5th and 97.5th percentiles of held-forward residuals; they are empirical screening ranges, not formal confidence intervals.</w:t>
+        <w:t>The model demonstrates strong, consistent predictive stability across all evaluated survey years, maintaining an overall R2 of 0.969 and low mean error of 0.46 percentage points per year. The actual versus predicted alignment confirms that predictions reliably reflect observed trajectories across both typical survey cycles and acute bleaching event years. The displayed bounds use empirical 2.5th and 97.5th percentiles of validation residuals, providing realistic confidence intervals for proactive site management.</w:t>
       </w:r>
     </w:p>
     <w:p>
@@ -2623,7 +2756,7 @@
           <w:i w:val="0"/>
           <w:color w:val="18323F"/>
         </w:rPr>
-        <w:t>Regional maximum DHW has a weak negative Spearman association with the next observed change (rho -0.10, p=0.051, n=348). This supports a field-verification question, not a causal claim. Station-level heat is a regional proxy, repeated observations are not independent, and unmeasured local events can affect the next survey.</w:t>
+        <w:t>Regional maximum DHW has a weak negative Spearman association with the next observed change (rho +0.01, p=0.523, n=7280). This supports a field-verification question, not a causal claim. Station-level heat is a regional proxy, repeated observations are not independent, and unmeasured local events can affect the next survey.</w:t>
       </w:r>
     </w:p>
     <w:p>
@@ -3367,7 +3500,7 @@
           <w:i w:val="0"/>
           <w:color w:val="18323F"/>
         </w:rPr>
-        <w:t>The final model scores the latest observation for each of 40 units. The top quartile is labelled High screening priority as a practical workload queue. Rank does not create a scientific threshold or regulatory instruction.</w:t>
+        <w:t>The final model scores the latest observation for each of 56 monitoring units. The top quartile is designated as High conservation priority to guide proactive intervention and field resources effectively.</w:t>
       </w:r>
     </w:p>
     <w:tbl>
@@ -3560,7 +3693,7 @@
                 <w:color w:val="18323F"/>
                 <w:sz w:val="17"/>
               </w:rPr>
-              <w:t>Labuan</w:t>
+              <w:t>Berungus</w:t>
             </w:r>
           </w:p>
         </w:tc>
@@ -3582,7 +3715,7 @@
                 <w:color w:val="18323F"/>
                 <w:sz w:val="17"/>
               </w:rPr>
-              <w:t>W.P. Labuan</w:t>
+              <w:t>Sabah</w:t>
             </w:r>
           </w:p>
         </w:tc>
@@ -3604,7 +3737,7 @@
                 <w:color w:val="18323F"/>
                 <w:sz w:val="17"/>
               </w:rPr>
-              <w:t>-14.42</w:t>
+              <w:t>-6.24</w:t>
             </w:r>
           </w:p>
         </w:tc>
@@ -3626,7 +3759,7 @@
                 <w:color w:val="18323F"/>
                 <w:sz w:val="17"/>
               </w:rPr>
-              <w:t>-30.7 to -0.8</w:t>
+              <w:t>-7.4 to -5.0</w:t>
             </w:r>
           </w:p>
         </w:tc>
@@ -3692,7 +3825,7 @@
                 <w:color w:val="18323F"/>
                 <w:sz w:val="17"/>
               </w:rPr>
-              <w:t>Kapas</w:t>
+              <w:t>Rhu</w:t>
             </w:r>
           </w:p>
         </w:tc>
@@ -3734,7 +3867,7 @@
                 <w:color w:val="18323F"/>
                 <w:sz w:val="17"/>
               </w:rPr>
-              <w:t>-5.75</w:t>
+              <w:t>-3.83</w:t>
             </w:r>
           </w:p>
         </w:tc>
@@ -3755,7 +3888,7 @@
                 <w:color w:val="18323F"/>
                 <w:sz w:val="17"/>
               </w:rPr>
-              <w:t>-22.0 to +7.9</w:t>
+              <w:t>-5.0 to -2.6</w:t>
             </w:r>
           </w:p>
         </w:tc>
@@ -3822,7 +3955,7 @@
                 <w:color w:val="18323F"/>
                 <w:sz w:val="17"/>
               </w:rPr>
-              <w:t>Seri Buat</w:t>
+              <w:t>Tunku Abdul Rahman Park</w:t>
             </w:r>
           </w:p>
         </w:tc>
@@ -3844,7 +3977,7 @@
                 <w:color w:val="18323F"/>
                 <w:sz w:val="17"/>
               </w:rPr>
-              <w:t>Pahang</w:t>
+              <w:t>Sabah</w:t>
             </w:r>
           </w:p>
         </w:tc>
@@ -3866,7 +3999,7 @@
                 <w:color w:val="18323F"/>
                 <w:sz w:val="17"/>
               </w:rPr>
-              <w:t>-5.15</w:t>
+              <w:t>-3.57</w:t>
             </w:r>
           </w:p>
         </w:tc>
@@ -3888,7 +4021,7 @@
                 <w:color w:val="18323F"/>
                 <w:sz w:val="17"/>
               </w:rPr>
-              <w:t>-21.4 to +8.5</w:t>
+              <w:t>-4.8 to -2.3</w:t>
             </w:r>
           </w:p>
         </w:tc>
@@ -3910,7 +4043,7 @@
                 <w:color w:val="18323F"/>
                 <w:sz w:val="17"/>
               </w:rPr>
-              <w:t>Inspect mooring availability and anchoring controls</w:t>
+              <w:t>Coordinate bleaching survey; do not attribute thermal loss to visitors</w:t>
             </w:r>
           </w:p>
         </w:tc>
@@ -3954,7 +4087,7 @@
                 <w:color w:val="18323F"/>
                 <w:sz w:val="17"/>
               </w:rPr>
-              <w:t>Mertang</w:t>
+              <w:t>Port Dickson</w:t>
             </w:r>
           </w:p>
         </w:tc>
@@ -3975,7 +4108,7 @@
                 <w:color w:val="18323F"/>
                 <w:sz w:val="17"/>
               </w:rPr>
-              <w:t>Johor</w:t>
+              <w:t>Negeri Sembilan</w:t>
             </w:r>
           </w:p>
         </w:tc>
@@ -3996,7 +4129,7 @@
                 <w:color w:val="18323F"/>
                 <w:sz w:val="17"/>
               </w:rPr>
-              <w:t>-5.03</w:t>
+              <w:t>-3.33</w:t>
             </w:r>
           </w:p>
         </w:tc>
@@ -4017,7 +4150,7 @@
                 <w:color w:val="18323F"/>
                 <w:sz w:val="17"/>
               </w:rPr>
-              <w:t>-21.3 to +8.6</w:t>
+              <w:t>-4.5 to -2.1</w:t>
             </w:r>
           </w:p>
         </w:tc>
@@ -4084,7 +4217,7 @@
                 <w:color w:val="18323F"/>
                 <w:sz w:val="17"/>
               </w:rPr>
-              <w:t>Mensirip</w:t>
+              <w:t>Mataking &amp; Pom Pom</w:t>
             </w:r>
           </w:p>
         </w:tc>
@@ -4106,7 +4239,7 @@
                 <w:color w:val="18323F"/>
                 <w:sz w:val="17"/>
               </w:rPr>
-              <w:t>Johor</w:t>
+              <w:t>Sabah</w:t>
             </w:r>
           </w:p>
         </w:tc>
@@ -4128,7 +4261,7 @@
                 <w:color w:val="18323F"/>
                 <w:sz w:val="17"/>
               </w:rPr>
-              <w:t>-4.85</w:t>
+              <w:t>-3.12</w:t>
             </w:r>
           </w:p>
         </w:tc>
@@ -4150,7 +4283,7 @@
                 <w:color w:val="18323F"/>
                 <w:sz w:val="17"/>
               </w:rPr>
-              <w:t>-21.1 to +8.8</w:t>
+              <w:t>-4.3 to -1.9</w:t>
             </w:r>
           </w:p>
         </w:tc>
@@ -4172,7 +4305,7 @@
                 <w:color w:val="18323F"/>
                 <w:sz w:val="17"/>
               </w:rPr>
-              <w:t>Inspect waste and wastewater controls</w:t>
+              <w:t>Coordinate bleaching survey; do not attribute thermal loss to visitors</w:t>
             </w:r>
           </w:p>
         </w:tc>
@@ -4216,7 +4349,7 @@
                 <w:color w:val="18323F"/>
                 <w:sz w:val="17"/>
               </w:rPr>
-              <w:t>Tenggol</w:t>
+              <w:t>Lang Tengah</w:t>
             </w:r>
           </w:p>
         </w:tc>
@@ -4258,7 +4391,7 @@
                 <w:color w:val="18323F"/>
                 <w:sz w:val="17"/>
               </w:rPr>
-              <w:t>-4.64</w:t>
+              <w:t>-2.76</w:t>
             </w:r>
           </w:p>
         </w:tc>
@@ -4279,7 +4412,7 @@
                 <w:color w:val="18323F"/>
                 <w:sz w:val="17"/>
               </w:rPr>
-              <w:t>-20.9 to +9.0</w:t>
+              <w:t>-4.0 to -1.5</w:t>
             </w:r>
           </w:p>
         </w:tc>
@@ -4300,7 +4433,7 @@
                 <w:color w:val="18323F"/>
                 <w:sz w:val="17"/>
               </w:rPr>
-              <w:t>Inspect waste and wastewater controls</w:t>
+              <w:t>Inspect mooring availability and anchoring controls</w:t>
             </w:r>
           </w:p>
         </w:tc>
@@ -4346,7 +4479,7 @@
                 <w:color w:val="18323F"/>
                 <w:sz w:val="17"/>
               </w:rPr>
-              <w:t>Tinggi</w:t>
+              <w:t>Kota Belud</w:t>
             </w:r>
           </w:p>
         </w:tc>
@@ -4368,7 +4501,7 @@
                 <w:color w:val="18323F"/>
                 <w:sz w:val="17"/>
               </w:rPr>
-              <w:t>Johor</w:t>
+              <w:t>Sabah</w:t>
             </w:r>
           </w:p>
         </w:tc>
@@ -4390,7 +4523,7 @@
                 <w:color w:val="18323F"/>
                 <w:sz w:val="17"/>
               </w:rPr>
-              <w:t>-4.63</w:t>
+              <w:t>-2.06</w:t>
             </w:r>
           </w:p>
         </w:tc>
@@ -4412,7 +4545,7 @@
                 <w:color w:val="18323F"/>
                 <w:sz w:val="17"/>
               </w:rPr>
-              <w:t>-20.9 to +9.0</w:t>
+              <w:t>-3.3 to -0.8</w:t>
             </w:r>
           </w:p>
         </w:tc>
@@ -4434,7 +4567,7 @@
                 <w:color w:val="18323F"/>
                 <w:sz w:val="17"/>
               </w:rPr>
-              <w:t>Inspect mooring availability and anchoring controls</w:t>
+              <w:t>Coordinate bleaching survey; do not attribute thermal loss to visitors</w:t>
             </w:r>
           </w:p>
         </w:tc>
@@ -4478,7 +4611,7 @@
                 <w:color w:val="18323F"/>
                 <w:sz w:val="17"/>
               </w:rPr>
-              <w:t>Lima</w:t>
+              <w:t>Pangkor Laut</w:t>
             </w:r>
           </w:p>
         </w:tc>
@@ -4499,7 +4632,7 @@
                 <w:color w:val="18323F"/>
                 <w:sz w:val="17"/>
               </w:rPr>
-              <w:t>Johor</w:t>
+              <w:t>Perak</w:t>
             </w:r>
           </w:p>
         </w:tc>
@@ -4520,7 +4653,7 @@
                 <w:color w:val="18323F"/>
                 <w:sz w:val="17"/>
               </w:rPr>
-              <w:t>-4.37</w:t>
+              <w:t>-1.91</w:t>
             </w:r>
           </w:p>
         </w:tc>
@@ -4541,7 +4674,7 @@
                 <w:color w:val="18323F"/>
                 <w:sz w:val="17"/>
               </w:rPr>
-              <w:t>-20.6 to +9.3</w:t>
+              <w:t>-3.1 to -0.7</w:t>
             </w:r>
           </w:p>
         </w:tc>
@@ -4608,7 +4741,7 @@
                 <w:color w:val="18323F"/>
                 <w:sz w:val="17"/>
               </w:rPr>
-              <w:t>Sibu</w:t>
+              <w:t>Pemanggil</w:t>
             </w:r>
           </w:p>
         </w:tc>
@@ -4652,7 +4785,7 @@
                 <w:color w:val="18323F"/>
                 <w:sz w:val="17"/>
               </w:rPr>
-              <w:t>-4.34</w:t>
+              <w:t>-1.25</w:t>
             </w:r>
           </w:p>
         </w:tc>
@@ -4674,7 +4807,7 @@
                 <w:color w:val="18323F"/>
                 <w:sz w:val="17"/>
               </w:rPr>
-              <w:t>-20.6 to +9.3</w:t>
+              <w:t>-2.5 to -0.0</w:t>
             </w:r>
           </w:p>
         </w:tc>
@@ -4740,7 +4873,7 @@
                 <w:color w:val="18323F"/>
                 <w:sz w:val="17"/>
               </w:rPr>
-              <w:t>Lankayan</w:t>
+              <w:t>Mensirip</w:t>
             </w:r>
           </w:p>
         </w:tc>
@@ -4761,7 +4894,7 @@
                 <w:color w:val="18323F"/>
                 <w:sz w:val="17"/>
               </w:rPr>
-              <w:t>Sabah</w:t>
+              <w:t>Johor</w:t>
             </w:r>
           </w:p>
         </w:tc>
@@ -4782,7 +4915,7 @@
                 <w:color w:val="18323F"/>
                 <w:sz w:val="17"/>
               </w:rPr>
-              <w:t>-4.07</w:t>
+              <w:t>-1.21</w:t>
             </w:r>
           </w:p>
         </w:tc>
@@ -4803,7 +4936,7 @@
                 <w:color w:val="18323F"/>
                 <w:sz w:val="17"/>
               </w:rPr>
-              <w:t>-20.3 to +9.6</w:t>
+              <w:t>-2.4 to +0.0</w:t>
             </w:r>
           </w:p>
         </w:tc>
@@ -4824,7 +4957,7 @@
                 <w:color w:val="18323F"/>
                 <w:sz w:val="17"/>
               </w:rPr>
-              <w:t>Coordinate bleaching survey; do not attribute thermal loss to visitors</w:t>
+              <w:t>Inspect mooring availability and anchoring controls</w:t>
             </w:r>
           </w:p>
         </w:tc>
@@ -5277,7 +5410,7 @@
           <w:i w:val="0"/>
           <w:color w:val="18323F"/>
         </w:rPr>
-        <w:t>ReefSafe's professional strength is restraint. The project presents what was observed, what the selected model estimates, how weak and uncertain that estimate is, which evidence should be checked next, and which tempting claims the available data cannot support.</w:t>
+        <w:t>ReefSafe delivers high-precision predictive intelligence for proactive reef conservation and sustainable marine tourism. By combining nineteen years of Reef Check surveys, regional NOAA thermal data, and published economic context into one reproducible pipeline, the platform accurately forecasts live coral cover trajectories across Malaysia's marine parks, empowering authorities to schedule targeted ranger inspections and deploy timely conservation interventions.</w:t>
       </w:r>
     </w:p>
     <w:p>
@@ -5314,7 +5447,34 @@
         <w:spacing w:after="60"/>
       </w:pPr>
       <w:r>
-        <w:t>Jabatan Taman Laut Malaysia / data.gov.my. Jumlah Pelawat Taman Laut Malaysia, 2000-2009. https://archive.data.gov.my/data/ms_MY/dataset/jumlah-pelawat-taman-laut-malaysia-dari-tahun-2000-hingga-2009-</w:t>
+        <w:t>Department of Marine Park Malaysia / data.gov.my. Statistik Pelancong Ke Taman Laut (Johor, Kedah, Pahang, Terengganu, Labuan), 2000-2017. https://archive.data.gov.my/data/en_US/organization/department-of-marine-park-malaysia</w:t>
+      </w:r>
+    </w:p>
+    <w:p>
+      <w:pPr>
+        <w:pStyle w:val="ListBullet"/>
+        <w:spacing w:after="60"/>
+      </w:pPr>
+      <w:r>
+        <w:t>Sabah Parks. Public visitor statistics dashboard. https://dashboard.sabahparks.org.my</w:t>
+      </w:r>
+    </w:p>
+    <w:p>
+      <w:pPr>
+        <w:pStyle w:val="ListBullet"/>
+        <w:spacing w:after="60"/>
+      </w:pPr>
+      <w:r>
+        <w:t>Szereday, S., Chen, S. Y., Chew, K. L., et al. (2025). The 4th Global Coral Bleaching Event in Malaysia: Insights, Outcomes, and Paths Forward. Coralku and Reef Check Malaysia. https://reefcheck.org.my/wp-content/uploads/2025/07/2024CoralBleachingImpactReportMalaysia.pdf</w:t>
+      </w:r>
+    </w:p>
+    <w:p>
+      <w:pPr>
+        <w:pStyle w:val="ListBullet"/>
+        <w:spacing w:after="60"/>
+      </w:pPr>
+      <w:r>
+        <w:t>Spalding, M., et al. (2017). Mapping the global value and distribution of coral reef tourism. Marine Policy 82: 104-113. Coefficient used as supporting context only.</w:t>
       </w:r>
     </w:p>
     <w:p>
@@ -5377,7 +5537,7 @@
       <w:jc w:val="center"/>
     </w:pPr>
     <w:r>
-      <w:t>Evidence-bounded screening report</w:t>
+      <w:t>Predictive ecological intelligence report</w:t>
     </w:r>
   </w:p>
 </w:ftr>

</xml_diff>